<commit_message>
feat: add refund payment statuses
</commit_message>
<xml_diff>
--- a/docs/Luong_thanh_toan_VNPay_SePay_CinemaBooking.docx
+++ b/docs/Luong_thanh_toan_VNPay_SePay_CinemaBooking.docx
@@ -3403,6 +3403,1186 @@
         <w:t>Không commit secret key, webhook secret, API key lên GitHub.</w:t>
       </w:r>
     </w:p>
+    <w:p>
+      <w:r>
+        <w:br w:type="page"/>
+      </w:r>
+    </w:p>
+    <w:p>
+      <w:pPr>
+        <w:jc w:val="center"/>
+      </w:pPr>
+      <w:r>
+        <w:rPr>
+          <w:rFonts w:ascii="Arial" w:hAnsi="Arial"/>
+          <w:b/>
+          <w:color w:val="0F172A"/>
+          <w:sz w:val="36"/>
+        </w:rPr>
+        <w:t>PHẦN HỌC NHANH VÀ ÔN BẢO VỆ</w:t>
+      </w:r>
+    </w:p>
+    <w:p>
+      <w:pPr>
+        <w:jc w:val="center"/>
+      </w:pPr>
+      <w:r>
+        <w:rPr>
+          <w:i/>
+        </w:rPr>
+        <w:t>Phần này tóm tắt lại tài liệu theo cách dễ học: nhìn sơ đồ trước, sau đó nối sang class và code.</w:t>
+      </w:r>
+    </w:p>
+    <w:p>
+      <w:pPr>
+        <w:pStyle w:val="Heading1"/>
+      </w:pPr>
+      <w:r>
+        <w:t>A. Cách đọc luồng thanh toán trong 15 phút</w:t>
+      </w:r>
+    </w:p>
+    <w:p>
+      <w:pPr>
+        <w:pStyle w:val="ListNumber"/>
+      </w:pPr>
+      <w:r>
+        <w:t>Đọc sơ đồ tổng quan để biết booking, payment, ghế và vé liên quan với nhau như thế nào.</w:t>
+      </w:r>
+    </w:p>
+    <w:p>
+      <w:pPr>
+        <w:pStyle w:val="ListNumber"/>
+      </w:pPr>
+      <w:r>
+        <w:t>Đọc riêng luồng VNPay để hiểu kiểu redirect: user đi sang cổng thanh toán rồi callback quay về backend.</w:t>
+      </w:r>
+    </w:p>
+    <w:p>
+      <w:pPr>
+        <w:pStyle w:val="ListNumber"/>
+      </w:pPr>
+      <w:r>
+        <w:t>Đọc riêng luồng Quét QR ngân hàng để hiểu kiểu webhook: user chuyển khoản, SePay báo tiền vào cho backend.</w:t>
+      </w:r>
+    </w:p>
+    <w:p>
+      <w:pPr>
+        <w:pStyle w:val="ListNumber"/>
+      </w:pPr>
+      <w:r>
+        <w:t>Đọc bảng câu hỏi bảo vệ để tập trả lời ngắn gọn: vì sao kiểm tra amount, vì sao cần idempotency, vì sao QR phải tạo lại khi đổi mã giảm giá.</w:t>
+      </w:r>
+    </w:p>
+    <w:tbl>
+      <w:tblPr>
+        <w:tblStyle w:val="TableGrid"/>
+        <w:tblW w:type="auto" w:w="0"/>
+        <w:jc w:val="center"/>
+        <w:tblLook w:firstColumn="1" w:firstRow="1" w:lastColumn="0" w:lastRow="0" w:noHBand="0" w:noVBand="1" w:val="04A0"/>
+      </w:tblPr>
+      <w:tblGrid>
+        <w:gridCol w:w="9936"/>
+      </w:tblGrid>
+      <w:tr>
+        <w:tc>
+          <w:tcPr>
+            <w:tcW w:type="dxa" w:w="9936"/>
+            <w:shd w:fill="ECFDF5"/>
+          </w:tcPr>
+          <w:p>
+            <w:r/>
+            <w:r>
+              <w:rPr>
+                <w:rFonts w:ascii="Arial" w:hAnsi="Arial"/>
+                <w:b/>
+                <w:color w:val="047857"/>
+                <w:sz w:val="20"/>
+              </w:rPr>
+              <w:t>Ý chính cần nhớ</w:t>
+            </w:r>
+          </w:p>
+          <w:p>
+            <w:pPr>
+              <w:spacing w:before="60"/>
+            </w:pPr>
+            <w:r>
+              <w:rPr>
+                <w:rFonts w:ascii="Arial" w:hAnsi="Arial"/>
+                <w:color w:val="1F2937"/>
+                <w:sz w:val="19"/>
+              </w:rPr>
+              <w:t>Frontend chỉ hiển thị và gửi yêu cầu. Backend mới là nơi quyết định booking có được thành công hay không. Backend luôn kiểm tra user, trạng thái booking, hạn giữ vé, số tiền, chữ ký callback/webhook và trạng thái payment trước khi sinh vé.</w:t>
+            </w:r>
+          </w:p>
+        </w:tc>
+      </w:tr>
+    </w:tbl>
+    <w:p/>
+    <w:p>
+      <w:pPr>
+        <w:pStyle w:val="Heading1"/>
+      </w:pPr>
+      <w:r>
+        <w:t>B. Sơ đồ dữ liệu: từ giữ ghế đến có vé</w:t>
+      </w:r>
+    </w:p>
+    <w:p>
+      <w:pPr>
+        <w:pStyle w:val="LearningCode"/>
+      </w:pPr>
+      <w:r>
+        <w:rPr>
+          <w:rFonts w:ascii="Consolas" w:hAnsi="Consolas"/>
+          <w:sz w:val="17"/>
+        </w:rPr>
+        <w:t>User chọn ghế</w:t>
+        <w:br/>
+        <w:t xml:space="preserve">  -&gt; seat_status = HOLD</w:t>
+        <w:br/>
+        <w:t xml:space="preserve">  -&gt; booking = PENDING</w:t>
+        <w:br/>
+        <w:t xml:space="preserve">  -&gt; payment = PENDING</w:t>
+        <w:br/>
+        <w:t xml:space="preserve">  -&gt; thanh toán thành công</w:t>
+        <w:br/>
+        <w:t xml:space="preserve">  -&gt; payment = SUCCESS</w:t>
+        <w:br/>
+        <w:t xml:space="preserve">  -&gt; booking = SUCCESS</w:t>
+        <w:br/>
+        <w:t xml:space="preserve">  -&gt; seat_status = BOOKED</w:t>
+        <w:br/>
+        <w:t xml:space="preserve">  -&gt; sinh ticket QR</w:t>
+        <w:br/>
+        <w:t xml:space="preserve">  -&gt; gửi email vé cho khách</w:t>
+      </w:r>
+    </w:p>
+    <w:p>
+      <w:r>
+        <w:t>Nếu thanh toán thất bại hoặc hết hạn, hướng đi sẽ ngược lại: payment FAILED/EXPIRED, booking FAILED/EXPIRED, ghế được trả về AVAILABLE để người khác có thể đặt.</w:t>
+      </w:r>
+    </w:p>
+    <w:p>
+      <w:pPr>
+        <w:pStyle w:val="Heading1"/>
+      </w:pPr>
+      <w:r>
+        <w:t>C. Sơ đồ luồng VNPay dễ nhớ</w:t>
+      </w:r>
+    </w:p>
+    <w:p>
+      <w:pPr>
+        <w:pStyle w:val="LearningCode"/>
+      </w:pPr>
+      <w:r>
+        <w:rPr>
+          <w:rFonts w:ascii="Consolas" w:hAnsi="Consolas"/>
+          <w:sz w:val="17"/>
+        </w:rPr>
+        <w:t>CheckoutPage</w:t>
+        <w:br/>
+        <w:t xml:space="preserve">  -&gt; paymentApi.initiatePayment(method = VNPAY)</w:t>
+        <w:br/>
+        <w:t xml:space="preserve">  -&gt; PaymentController.initiatePayment()</w:t>
+        <w:br/>
+        <w:t xml:space="preserve">  -&gt; PaymentServiceImpl.initiatePayment()</w:t>
+        <w:br/>
+        <w:t xml:space="preserve">  -&gt; VnPayPaymentGateway.createPaymentUrl()</w:t>
+        <w:br/>
+        <w:t xml:space="preserve">  -&gt; frontend redirect sang VNPay</w:t>
+        <w:br/>
+        <w:t xml:space="preserve">  -&gt; user thanh toán trên VNPay</w:t>
+        <w:br/>
+        <w:t xml:space="preserve">  -&gt; VNPay callback về /payments/vnpay-callback</w:t>
+        <w:br/>
+        <w:t xml:space="preserve">  -&gt; PaymentServiceImpl.handleVNPayCallback()</w:t>
+        <w:br/>
+        <w:t xml:space="preserve">  -&gt; kiểm tra chữ ký + amount + hạn giữ vé</w:t>
+        <w:br/>
+        <w:t xml:space="preserve">  -&gt; BookingServiceImpl.handlePaymentSuccess()</w:t>
+        <w:br/>
+        <w:t xml:space="preserve">  -&gt; booking SUCCESS, ghế BOOKED, sinh ticket</w:t>
+      </w:r>
+    </w:p>
+    <w:p>
+      <w:pPr>
+        <w:pStyle w:val="Heading1"/>
+      </w:pPr>
+      <w:r>
+        <w:t>D. Sơ đồ luồng Quét QR ngân hàng dễ nhớ</w:t>
+      </w:r>
+    </w:p>
+    <w:p>
+      <w:pPr>
+        <w:pStyle w:val="LearningCode"/>
+      </w:pPr>
+      <w:r>
+        <w:rPr>
+          <w:rFonts w:ascii="Consolas" w:hAnsi="Consolas"/>
+          <w:sz w:val="17"/>
+        </w:rPr>
+        <w:t>CheckoutPage</w:t>
+        <w:br/>
+        <w:t xml:space="preserve">  -&gt; paymentApi.initiatePayment(method = SEPAY)</w:t>
+        <w:br/>
+        <w:t xml:space="preserve">  -&gt; PaymentServiceImpl.initiatePayment()</w:t>
+        <w:br/>
+        <w:t xml:space="preserve">  -&gt; SePayPaymentGateway.createPaymentUrl()</w:t>
+        <w:br/>
+        <w:t xml:space="preserve">  -&gt; backend trả sepay://pay?... chứa qrUrl, amount, transferContent</w:t>
+        <w:br/>
+        <w:t xml:space="preserve">  -&gt; frontend hiển thị QR</w:t>
+        <w:br/>
+        <w:t xml:space="preserve">  -&gt; user chuyển khoản bằng app ngân hàng</w:t>
+        <w:br/>
+        <w:t xml:space="preserve">  -&gt; SePay gửi webhook về /payments/sepay-webhook</w:t>
+        <w:br/>
+        <w:t xml:space="preserve">  -&gt; PaymentServiceImpl.handleSePayWebhook()</w:t>
+        <w:br/>
+        <w:t xml:space="preserve">  -&gt; kiểm tra API key/HMAC + amount + nội dung chuyển khoản</w:t>
+        <w:br/>
+        <w:t xml:space="preserve">  -&gt; BookingServiceImpl.handlePaymentSuccess()</w:t>
+        <w:br/>
+        <w:t xml:space="preserve">  -&gt; booking SUCCESS, ghế BOOKED, sinh ticket</w:t>
+      </w:r>
+    </w:p>
+    <w:p>
+      <w:pPr>
+        <w:pStyle w:val="Heading1"/>
+      </w:pPr>
+      <w:r>
+        <w:t>E. Bảng thuật ngữ thanh toán</w:t>
+      </w:r>
+    </w:p>
+    <w:tbl>
+      <w:tblPr>
+        <w:tblStyle w:val="TableGrid"/>
+        <w:tblW w:type="auto" w:w="0"/>
+        <w:jc w:val="center"/>
+        <w:tblLook w:firstColumn="1" w:firstRow="1" w:lastColumn="0" w:lastRow="0" w:noHBand="0" w:noVBand="1" w:val="04A0"/>
+      </w:tblPr>
+      <w:tblGrid>
+        <w:gridCol w:w="3312"/>
+        <w:gridCol w:w="3312"/>
+        <w:gridCol w:w="3312"/>
+      </w:tblGrid>
+      <w:tr>
+        <w:tc>
+          <w:tcPr>
+            <w:tcW w:type="dxa" w:w="2088"/>
+            <w:vAlign w:val="center"/>
+            <w:shd w:fill="111827"/>
+          </w:tcPr>
+          <w:p>
+            <w:r/>
+            <w:r>
+              <w:rPr>
+                <w:rFonts w:ascii="Arial" w:hAnsi="Arial"/>
+                <w:b/>
+                <w:color w:val="FFFFFF"/>
+                <w:sz w:val="18"/>
+              </w:rPr>
+              <w:t>Thuật ngữ</w:t>
+            </w:r>
+          </w:p>
+        </w:tc>
+        <w:tc>
+          <w:tcPr>
+            <w:tcW w:type="dxa" w:w="3384"/>
+            <w:vAlign w:val="center"/>
+            <w:shd w:fill="111827"/>
+          </w:tcPr>
+          <w:p>
+            <w:r/>
+            <w:r>
+              <w:rPr>
+                <w:rFonts w:ascii="Arial" w:hAnsi="Arial"/>
+                <w:b/>
+                <w:color w:val="FFFFFF"/>
+                <w:sz w:val="18"/>
+              </w:rPr>
+              <w:t>Hiểu đơn giản</w:t>
+            </w:r>
+          </w:p>
+        </w:tc>
+        <w:tc>
+          <w:tcPr>
+            <w:tcW w:type="dxa" w:w="3888"/>
+            <w:vAlign w:val="center"/>
+            <w:shd w:fill="111827"/>
+          </w:tcPr>
+          <w:p>
+            <w:r/>
+            <w:r>
+              <w:rPr>
+                <w:rFonts w:ascii="Arial" w:hAnsi="Arial"/>
+                <w:b/>
+                <w:color w:val="FFFFFF"/>
+                <w:sz w:val="18"/>
+              </w:rPr>
+              <w:t>Trong code/hệ thống</w:t>
+            </w:r>
+          </w:p>
+        </w:tc>
+      </w:tr>
+      <w:tr>
+        <w:tc>
+          <w:tcPr>
+            <w:tcW w:type="dxa" w:w="2088"/>
+            <w:vAlign w:val="center"/>
+          </w:tcPr>
+          <w:p>
+            <w:r/>
+            <w:r>
+              <w:rPr>
+                <w:rFonts w:ascii="Arial" w:hAnsi="Arial"/>
+                <w:b/>
+                <w:color w:val="111827"/>
+                <w:sz w:val="17"/>
+              </w:rPr>
+              <w:t>Booking</w:t>
+            </w:r>
+          </w:p>
+        </w:tc>
+        <w:tc>
+          <w:tcPr>
+            <w:tcW w:type="dxa" w:w="3384"/>
+            <w:vAlign w:val="center"/>
+          </w:tcPr>
+          <w:p>
+            <w:r/>
+            <w:r>
+              <w:rPr>
+                <w:rFonts w:ascii="Arial" w:hAnsi="Arial"/>
+                <w:b w:val="0"/>
+                <w:color w:val="111827"/>
+                <w:sz w:val="17"/>
+              </w:rPr>
+              <w:t>Đơn đặt vé của user.</w:t>
+            </w:r>
+          </w:p>
+        </w:tc>
+        <w:tc>
+          <w:tcPr>
+            <w:tcW w:type="dxa" w:w="3888"/>
+            <w:vAlign w:val="center"/>
+          </w:tcPr>
+          <w:p>
+            <w:r/>
+            <w:r>
+              <w:rPr>
+                <w:rFonts w:ascii="Arial" w:hAnsi="Arial"/>
+                <w:b w:val="0"/>
+                <w:color w:val="111827"/>
+                <w:sz w:val="17"/>
+              </w:rPr>
+              <w:t>Booking entity, BookingServiceImpl.</w:t>
+            </w:r>
+          </w:p>
+        </w:tc>
+      </w:tr>
+      <w:tr>
+        <w:tc>
+          <w:tcPr>
+            <w:tcW w:type="dxa" w:w="2088"/>
+            <w:vAlign w:val="center"/>
+          </w:tcPr>
+          <w:p>
+            <w:r/>
+            <w:r>
+              <w:rPr>
+                <w:rFonts w:ascii="Arial" w:hAnsi="Arial"/>
+                <w:b/>
+                <w:color w:val="111827"/>
+                <w:sz w:val="17"/>
+              </w:rPr>
+              <w:t>Payment</w:t>
+            </w:r>
+          </w:p>
+        </w:tc>
+        <w:tc>
+          <w:tcPr>
+            <w:tcW w:type="dxa" w:w="3384"/>
+            <w:vAlign w:val="center"/>
+          </w:tcPr>
+          <w:p>
+            <w:r/>
+            <w:r>
+              <w:rPr>
+                <w:rFonts w:ascii="Arial" w:hAnsi="Arial"/>
+                <w:b w:val="0"/>
+                <w:color w:val="111827"/>
+                <w:sz w:val="17"/>
+              </w:rPr>
+              <w:t>Một lần tạo thanh toán cho booking.</w:t>
+            </w:r>
+          </w:p>
+        </w:tc>
+        <w:tc>
+          <w:tcPr>
+            <w:tcW w:type="dxa" w:w="3888"/>
+            <w:vAlign w:val="center"/>
+          </w:tcPr>
+          <w:p>
+            <w:r/>
+            <w:r>
+              <w:rPr>
+                <w:rFonts w:ascii="Arial" w:hAnsi="Arial"/>
+                <w:b w:val="0"/>
+                <w:color w:val="111827"/>
+                <w:sz w:val="17"/>
+              </w:rPr>
+              <w:t>Payment entity, PaymentServiceImpl.</w:t>
+            </w:r>
+          </w:p>
+        </w:tc>
+      </w:tr>
+      <w:tr>
+        <w:tc>
+          <w:tcPr>
+            <w:tcW w:type="dxa" w:w="2088"/>
+            <w:vAlign w:val="center"/>
+          </w:tcPr>
+          <w:p>
+            <w:r/>
+            <w:r>
+              <w:rPr>
+                <w:rFonts w:ascii="Arial" w:hAnsi="Arial"/>
+                <w:b/>
+                <w:color w:val="111827"/>
+                <w:sz w:val="17"/>
+              </w:rPr>
+              <w:t>PaymentEvent</w:t>
+            </w:r>
+          </w:p>
+        </w:tc>
+        <w:tc>
+          <w:tcPr>
+            <w:tcW w:type="dxa" w:w="3384"/>
+            <w:vAlign w:val="center"/>
+          </w:tcPr>
+          <w:p>
+            <w:r/>
+            <w:r>
+              <w:rPr>
+                <w:rFonts w:ascii="Arial" w:hAnsi="Arial"/>
+                <w:b w:val="0"/>
+                <w:color w:val="111827"/>
+                <w:sz w:val="17"/>
+              </w:rPr>
+              <w:t>Nhật ký từng bước của payment.</w:t>
+            </w:r>
+          </w:p>
+        </w:tc>
+        <w:tc>
+          <w:tcPr>
+            <w:tcW w:type="dxa" w:w="3888"/>
+            <w:vAlign w:val="center"/>
+          </w:tcPr>
+          <w:p>
+            <w:r/>
+            <w:r>
+              <w:rPr>
+                <w:rFonts w:ascii="Arial" w:hAnsi="Arial"/>
+                <w:b w:val="0"/>
+                <w:color w:val="111827"/>
+                <w:sz w:val="17"/>
+              </w:rPr>
+              <w:t>PaymentEventService, admin payment events.</w:t>
+            </w:r>
+          </w:p>
+        </w:tc>
+      </w:tr>
+      <w:tr>
+        <w:tc>
+          <w:tcPr>
+            <w:tcW w:type="dxa" w:w="2088"/>
+            <w:vAlign w:val="center"/>
+          </w:tcPr>
+          <w:p>
+            <w:r/>
+            <w:r>
+              <w:rPr>
+                <w:rFonts w:ascii="Arial" w:hAnsi="Arial"/>
+                <w:b/>
+                <w:color w:val="111827"/>
+                <w:sz w:val="17"/>
+              </w:rPr>
+              <w:t>Callback</w:t>
+            </w:r>
+          </w:p>
+        </w:tc>
+        <w:tc>
+          <w:tcPr>
+            <w:tcW w:type="dxa" w:w="3384"/>
+            <w:vAlign w:val="center"/>
+          </w:tcPr>
+          <w:p>
+            <w:r/>
+            <w:r>
+              <w:rPr>
+                <w:rFonts w:ascii="Arial" w:hAnsi="Arial"/>
+                <w:b w:val="0"/>
+                <w:color w:val="111827"/>
+                <w:sz w:val="17"/>
+              </w:rPr>
+              <w:t>Cổng thanh toán redirect/gọi lại sau giao dịch.</w:t>
+            </w:r>
+          </w:p>
+        </w:tc>
+        <w:tc>
+          <w:tcPr>
+            <w:tcW w:type="dxa" w:w="3888"/>
+            <w:vAlign w:val="center"/>
+          </w:tcPr>
+          <w:p>
+            <w:r/>
+            <w:r>
+              <w:rPr>
+                <w:rFonts w:ascii="Arial" w:hAnsi="Arial"/>
+                <w:b w:val="0"/>
+                <w:color w:val="111827"/>
+                <w:sz w:val="17"/>
+              </w:rPr>
+              <w:t>VNPay callback.</w:t>
+            </w:r>
+          </w:p>
+        </w:tc>
+      </w:tr>
+      <w:tr>
+        <w:tc>
+          <w:tcPr>
+            <w:tcW w:type="dxa" w:w="2088"/>
+            <w:vAlign w:val="center"/>
+          </w:tcPr>
+          <w:p>
+            <w:r/>
+            <w:r>
+              <w:rPr>
+                <w:rFonts w:ascii="Arial" w:hAnsi="Arial"/>
+                <w:b/>
+                <w:color w:val="111827"/>
+                <w:sz w:val="17"/>
+              </w:rPr>
+              <w:t>Webhook</w:t>
+            </w:r>
+          </w:p>
+        </w:tc>
+        <w:tc>
+          <w:tcPr>
+            <w:tcW w:type="dxa" w:w="3384"/>
+            <w:vAlign w:val="center"/>
+          </w:tcPr>
+          <w:p>
+            <w:r/>
+            <w:r>
+              <w:rPr>
+                <w:rFonts w:ascii="Arial" w:hAnsi="Arial"/>
+                <w:b w:val="0"/>
+                <w:color w:val="111827"/>
+                <w:sz w:val="17"/>
+              </w:rPr>
+              <w:t>Server bên ngoài tự báo sự kiện về backend.</w:t>
+            </w:r>
+          </w:p>
+        </w:tc>
+        <w:tc>
+          <w:tcPr>
+            <w:tcW w:type="dxa" w:w="3888"/>
+            <w:vAlign w:val="center"/>
+          </w:tcPr>
+          <w:p>
+            <w:r/>
+            <w:r>
+              <w:rPr>
+                <w:rFonts w:ascii="Arial" w:hAnsi="Arial"/>
+                <w:b w:val="0"/>
+                <w:color w:val="111827"/>
+                <w:sz w:val="17"/>
+              </w:rPr>
+              <w:t>SePay webhook.</w:t>
+            </w:r>
+          </w:p>
+        </w:tc>
+      </w:tr>
+      <w:tr>
+        <w:tc>
+          <w:tcPr>
+            <w:tcW w:type="dxa" w:w="2088"/>
+            <w:vAlign w:val="center"/>
+          </w:tcPr>
+          <w:p>
+            <w:r/>
+            <w:r>
+              <w:rPr>
+                <w:rFonts w:ascii="Arial" w:hAnsi="Arial"/>
+                <w:b/>
+                <w:color w:val="111827"/>
+                <w:sz w:val="17"/>
+              </w:rPr>
+              <w:t>Idempotency</w:t>
+            </w:r>
+          </w:p>
+        </w:tc>
+        <w:tc>
+          <w:tcPr>
+            <w:tcW w:type="dxa" w:w="3384"/>
+            <w:vAlign w:val="center"/>
+          </w:tcPr>
+          <w:p>
+            <w:r/>
+            <w:r>
+              <w:rPr>
+                <w:rFonts w:ascii="Arial" w:hAnsi="Arial"/>
+                <w:b w:val="0"/>
+                <w:color w:val="111827"/>
+                <w:sz w:val="17"/>
+              </w:rPr>
+              <w:t>Callback/webhook gửi nhiều lần vẫn không xử lý trùng.</w:t>
+            </w:r>
+          </w:p>
+        </w:tc>
+        <w:tc>
+          <w:tcPr>
+            <w:tcW w:type="dxa" w:w="3888"/>
+            <w:vAlign w:val="center"/>
+          </w:tcPr>
+          <w:p>
+            <w:r/>
+            <w:r>
+              <w:rPr>
+                <w:rFonts w:ascii="Arial" w:hAnsi="Arial"/>
+                <w:b w:val="0"/>
+                <w:color w:val="111827"/>
+                <w:sz w:val="17"/>
+              </w:rPr>
+              <w:t>Kiểm tra payment status trước khi update.</w:t>
+            </w:r>
+          </w:p>
+        </w:tc>
+      </w:tr>
+      <w:tr>
+        <w:tc>
+          <w:tcPr>
+            <w:tcW w:type="dxa" w:w="2088"/>
+            <w:vAlign w:val="center"/>
+          </w:tcPr>
+          <w:p>
+            <w:r/>
+            <w:r>
+              <w:rPr>
+                <w:rFonts w:ascii="Arial" w:hAnsi="Arial"/>
+                <w:b/>
+                <w:color w:val="111827"/>
+                <w:sz w:val="17"/>
+              </w:rPr>
+              <w:t>Amount check</w:t>
+            </w:r>
+          </w:p>
+        </w:tc>
+        <w:tc>
+          <w:tcPr>
+            <w:tcW w:type="dxa" w:w="3384"/>
+            <w:vAlign w:val="center"/>
+          </w:tcPr>
+          <w:p>
+            <w:r/>
+            <w:r>
+              <w:rPr>
+                <w:rFonts w:ascii="Arial" w:hAnsi="Arial"/>
+                <w:b w:val="0"/>
+                <w:color w:val="111827"/>
+                <w:sz w:val="17"/>
+              </w:rPr>
+              <w:t>So tiền callback/webhook với tiền trong DB.</w:t>
+            </w:r>
+          </w:p>
+        </w:tc>
+        <w:tc>
+          <w:tcPr>
+            <w:tcW w:type="dxa" w:w="3888"/>
+            <w:vAlign w:val="center"/>
+          </w:tcPr>
+          <w:p>
+            <w:r/>
+            <w:r>
+              <w:rPr>
+                <w:rFonts w:ascii="Arial" w:hAnsi="Arial"/>
+                <w:b w:val="0"/>
+                <w:color w:val="111827"/>
+                <w:sz w:val="17"/>
+              </w:rPr>
+              <w:t>Chống thanh toán thiếu/sai số tiền.</w:t>
+            </w:r>
+          </w:p>
+        </w:tc>
+      </w:tr>
+      <w:tr>
+        <w:tc>
+          <w:tcPr>
+            <w:tcW w:type="dxa" w:w="2088"/>
+            <w:vAlign w:val="center"/>
+          </w:tcPr>
+          <w:p>
+            <w:r/>
+            <w:r>
+              <w:rPr>
+                <w:rFonts w:ascii="Arial" w:hAnsi="Arial"/>
+                <w:b/>
+                <w:color w:val="111827"/>
+                <w:sz w:val="17"/>
+              </w:rPr>
+              <w:t>Transaction lock</w:t>
+            </w:r>
+          </w:p>
+        </w:tc>
+        <w:tc>
+          <w:tcPr>
+            <w:tcW w:type="dxa" w:w="3384"/>
+            <w:vAlign w:val="center"/>
+          </w:tcPr>
+          <w:p>
+            <w:r/>
+            <w:r>
+              <w:rPr>
+                <w:rFonts w:ascii="Arial" w:hAnsi="Arial"/>
+                <w:b w:val="0"/>
+                <w:color w:val="111827"/>
+                <w:sz w:val="17"/>
+              </w:rPr>
+              <w:t>Khóa payment khi xử lý callback/webhook.</w:t>
+            </w:r>
+          </w:p>
+        </w:tc>
+        <w:tc>
+          <w:tcPr>
+            <w:tcW w:type="dxa" w:w="3888"/>
+            <w:vAlign w:val="center"/>
+          </w:tcPr>
+          <w:p>
+            <w:r/>
+            <w:r>
+              <w:rPr>
+                <w:rFonts w:ascii="Arial" w:hAnsi="Arial"/>
+                <w:b w:val="0"/>
+                <w:color w:val="111827"/>
+                <w:sz w:val="17"/>
+              </w:rPr>
+              <w:t>findLockedByTransactionNo.</w:t>
+            </w:r>
+          </w:p>
+        </w:tc>
+      </w:tr>
+    </w:tbl>
+    <w:p/>
+    <w:p>
+      <w:pPr>
+        <w:pStyle w:val="Heading1"/>
+      </w:pPr>
+      <w:r>
+        <w:t>F. Đọc code theo thứ tự nào?</w:t>
+      </w:r>
+    </w:p>
+    <w:p>
+      <w:pPr>
+        <w:pStyle w:val="ListNumber"/>
+      </w:pPr>
+      <w:r>
+        <w:t>Mở CheckoutPage.tsx để xem người dùng bấm thanh toán và frontend gọi API.</w:t>
+      </w:r>
+    </w:p>
+    <w:p>
+      <w:pPr>
+        <w:pStyle w:val="ListNumber"/>
+      </w:pPr>
+      <w:r>
+        <w:t>Mở paymentApi.ts để xem endpoint frontend gọi xuống backend.</w:t>
+      </w:r>
+    </w:p>
+    <w:p>
+      <w:pPr>
+        <w:pStyle w:val="ListNumber"/>
+      </w:pPr>
+      <w:r>
+        <w:t>Mở PaymentController.java để xem request được nhận ở đâu.</w:t>
+      </w:r>
+    </w:p>
+    <w:p>
+      <w:pPr>
+        <w:pStyle w:val="ListNumber"/>
+      </w:pPr>
+      <w:r>
+        <w:t>Mở PaymentServiceImpl.java để đọc nghiệp vụ chính: tạo payment, callback VNPay, webhook SePay.</w:t>
+      </w:r>
+    </w:p>
+    <w:p>
+      <w:pPr>
+        <w:pStyle w:val="ListNumber"/>
+      </w:pPr>
+      <w:r>
+        <w:t>Mở VnPayPaymentGateway.java hoặc SePayPaymentGateway.java để xem từng cổng tạo URL/QR như thế nào.</w:t>
+      </w:r>
+    </w:p>
+    <w:p>
+      <w:pPr>
+        <w:pStyle w:val="ListNumber"/>
+      </w:pPr>
+      <w:r>
+        <w:t>Mở BookingServiceImpl.java để xem lúc payment SUCCESS thì ghế và ticket được cập nhật ra sao.</w:t>
+      </w:r>
+    </w:p>
+    <w:p>
+      <w:pPr>
+        <w:pStyle w:val="ListNumber"/>
+      </w:pPr>
+      <w:r>
+        <w:t>Mở PaymentEventServiceImpl.java để hiểu admin đối soát payment bằng nhật ký nào.</w:t>
+      </w:r>
+    </w:p>
+    <w:p>
+      <w:pPr>
+        <w:pStyle w:val="Heading1"/>
+      </w:pPr>
+      <w:r>
+        <w:t>G. Câu hỏi bảo vệ và cách trả lời ngắn</w:t>
+      </w:r>
+    </w:p>
+    <w:tbl>
+      <w:tblPr>
+        <w:tblStyle w:val="TableGrid"/>
+        <w:tblW w:type="auto" w:w="0"/>
+        <w:jc w:val="center"/>
+        <w:tblLook w:firstColumn="1" w:firstRow="1" w:lastColumn="0" w:lastRow="0" w:noHBand="0" w:noVBand="1" w:val="04A0"/>
+      </w:tblPr>
+      <w:tblGrid>
+        <w:gridCol w:w="4968"/>
+        <w:gridCol w:w="4968"/>
+      </w:tblGrid>
+      <w:tr>
+        <w:tc>
+          <w:tcPr>
+            <w:tcW w:type="dxa" w:w="3528"/>
+            <w:vAlign w:val="center"/>
+            <w:shd w:fill="111827"/>
+          </w:tcPr>
+          <w:p>
+            <w:r/>
+            <w:r>
+              <w:rPr>
+                <w:rFonts w:ascii="Arial" w:hAnsi="Arial"/>
+                <w:b/>
+                <w:color w:val="FFFFFF"/>
+                <w:sz w:val="18"/>
+              </w:rPr>
+              <w:t>Câu hỏi</w:t>
+            </w:r>
+          </w:p>
+        </w:tc>
+        <w:tc>
+          <w:tcPr>
+            <w:tcW w:type="dxa" w:w="5832"/>
+            <w:vAlign w:val="center"/>
+            <w:shd w:fill="111827"/>
+          </w:tcPr>
+          <w:p>
+            <w:r/>
+            <w:r>
+              <w:rPr>
+                <w:rFonts w:ascii="Arial" w:hAnsi="Arial"/>
+                <w:b/>
+                <w:color w:val="FFFFFF"/>
+                <w:sz w:val="18"/>
+              </w:rPr>
+              <w:t>Trả lời trọng tâm</w:t>
+            </w:r>
+          </w:p>
+        </w:tc>
+      </w:tr>
+      <w:tr>
+        <w:tc>
+          <w:tcPr>
+            <w:tcW w:type="dxa" w:w="3528"/>
+            <w:vAlign w:val="center"/>
+          </w:tcPr>
+          <w:p>
+            <w:r/>
+            <w:r>
+              <w:rPr>
+                <w:rFonts w:ascii="Arial" w:hAnsi="Arial"/>
+                <w:b/>
+                <w:color w:val="111827"/>
+                <w:sz w:val="17"/>
+              </w:rPr>
+              <w:t>Vì sao backend không tin amount từ frontend?</w:t>
+            </w:r>
+          </w:p>
+        </w:tc>
+        <w:tc>
+          <w:tcPr>
+            <w:tcW w:type="dxa" w:w="5832"/>
+            <w:vAlign w:val="center"/>
+          </w:tcPr>
+          <w:p>
+            <w:r/>
+            <w:r>
+              <w:rPr>
+                <w:rFonts w:ascii="Arial" w:hAnsi="Arial"/>
+                <w:b w:val="0"/>
+                <w:color w:val="111827"/>
+                <w:sz w:val="17"/>
+              </w:rPr>
+              <w:t>Vì request frontend có thể bị sửa hoặc stale khi đổi mã giảm giá. Backend lấy booking.totalPrice trong DB làm chuẩn.</w:t>
+            </w:r>
+          </w:p>
+        </w:tc>
+      </w:tr>
+      <w:tr>
+        <w:tc>
+          <w:tcPr>
+            <w:tcW w:type="dxa" w:w="3528"/>
+            <w:vAlign w:val="center"/>
+          </w:tcPr>
+          <w:p>
+            <w:r/>
+            <w:r>
+              <w:rPr>
+                <w:rFonts w:ascii="Arial" w:hAnsi="Arial"/>
+                <w:b/>
+                <w:color w:val="111827"/>
+                <w:sz w:val="17"/>
+              </w:rPr>
+              <w:t>Vì sao QR phải tạo lại khi đổi mã giảm giá?</w:t>
+            </w:r>
+          </w:p>
+        </w:tc>
+        <w:tc>
+          <w:tcPr>
+            <w:tcW w:type="dxa" w:w="5832"/>
+            <w:vAlign w:val="center"/>
+          </w:tcPr>
+          <w:p>
+            <w:r/>
+            <w:r>
+              <w:rPr>
+                <w:rFonts w:ascii="Arial" w:hAnsi="Arial"/>
+                <w:b w:val="0"/>
+                <w:color w:val="111827"/>
+                <w:sz w:val="17"/>
+              </w:rPr>
+              <w:t>QR đã cố định số tiền và nội dung chuyển khoản. Đổi mã làm tổng tiền đổi, nên QR cũ phải bỏ để tránh chuyển sai tiền.</w:t>
+            </w:r>
+          </w:p>
+        </w:tc>
+      </w:tr>
+      <w:tr>
+        <w:tc>
+          <w:tcPr>
+            <w:tcW w:type="dxa" w:w="3528"/>
+            <w:vAlign w:val="center"/>
+          </w:tcPr>
+          <w:p>
+            <w:r/>
+            <w:r>
+              <w:rPr>
+                <w:rFonts w:ascii="Arial" w:hAnsi="Arial"/>
+                <w:b/>
+                <w:color w:val="111827"/>
+                <w:sz w:val="17"/>
+              </w:rPr>
+              <w:t>Nếu VNPay callback hai lần thì sao?</w:t>
+            </w:r>
+          </w:p>
+        </w:tc>
+        <w:tc>
+          <w:tcPr>
+            <w:tcW w:type="dxa" w:w="5832"/>
+            <w:vAlign w:val="center"/>
+          </w:tcPr>
+          <w:p>
+            <w:r/>
+            <w:r>
+              <w:rPr>
+                <w:rFonts w:ascii="Arial" w:hAnsi="Arial"/>
+                <w:b w:val="0"/>
+                <w:color w:val="111827"/>
+                <w:sz w:val="17"/>
+              </w:rPr>
+              <w:t>Backend kiểm tra payment status. Nếu đã SUCCESS/FAILED/EXPIRED thì không xử lý lại, chỉ trả kết quả hiện tại.</w:t>
+            </w:r>
+          </w:p>
+        </w:tc>
+      </w:tr>
+      <w:tr>
+        <w:tc>
+          <w:tcPr>
+            <w:tcW w:type="dxa" w:w="3528"/>
+            <w:vAlign w:val="center"/>
+          </w:tcPr>
+          <w:p>
+            <w:r/>
+            <w:r>
+              <w:rPr>
+                <w:rFonts w:ascii="Arial" w:hAnsi="Arial"/>
+                <w:b/>
+                <w:color w:val="111827"/>
+                <w:sz w:val="17"/>
+              </w:rPr>
+              <w:t>Webhook SePay khác nút Tôi đã chuyển khoản như thế nào?</w:t>
+            </w:r>
+          </w:p>
+        </w:tc>
+        <w:tc>
+          <w:tcPr>
+            <w:tcW w:type="dxa" w:w="5832"/>
+            <w:vAlign w:val="center"/>
+          </w:tcPr>
+          <w:p>
+            <w:r/>
+            <w:r>
+              <w:rPr>
+                <w:rFonts w:ascii="Arial" w:hAnsi="Arial"/>
+                <w:b w:val="0"/>
+                <w:color w:val="111827"/>
+                <w:sz w:val="17"/>
+              </w:rPr>
+              <w:t>Webhook là xác nhận thật từ server SePay. Nút Tôi đã chuyển khoản chỉ refetch booking để kiểm tra webhook đã đến chưa.</w:t>
+            </w:r>
+          </w:p>
+        </w:tc>
+      </w:tr>
+      <w:tr>
+        <w:tc>
+          <w:tcPr>
+            <w:tcW w:type="dxa" w:w="3528"/>
+            <w:vAlign w:val="center"/>
+          </w:tcPr>
+          <w:p>
+            <w:r/>
+            <w:r>
+              <w:rPr>
+                <w:rFonts w:ascii="Arial" w:hAnsi="Arial"/>
+                <w:b/>
+                <w:color w:val="111827"/>
+                <w:sz w:val="17"/>
+              </w:rPr>
+              <w:t>Khi payment thành công thì ai sinh vé?</w:t>
+            </w:r>
+          </w:p>
+        </w:tc>
+        <w:tc>
+          <w:tcPr>
+            <w:tcW w:type="dxa" w:w="5832"/>
+            <w:vAlign w:val="center"/>
+          </w:tcPr>
+          <w:p>
+            <w:r/>
+            <w:r>
+              <w:rPr>
+                <w:rFonts w:ascii="Arial" w:hAnsi="Arial"/>
+                <w:b w:val="0"/>
+                <w:color w:val="111827"/>
+                <w:sz w:val="17"/>
+              </w:rPr>
+              <w:t>PaymentService xác nhận payment, sau đó gọi BookingServiceImpl.handlePaymentSuccess để đổi ghế BOOKED và sinh ticket.</w:t>
+            </w:r>
+          </w:p>
+        </w:tc>
+      </w:tr>
+      <w:tr>
+        <w:tc>
+          <w:tcPr>
+            <w:tcW w:type="dxa" w:w="3528"/>
+            <w:vAlign w:val="center"/>
+          </w:tcPr>
+          <w:p>
+            <w:r/>
+            <w:r>
+              <w:rPr>
+                <w:rFonts w:ascii="Arial" w:hAnsi="Arial"/>
+                <w:b/>
+                <w:color w:val="111827"/>
+                <w:sz w:val="17"/>
+              </w:rPr>
+              <w:t>Nếu callback đến sau khi hết hạn giữ vé?</w:t>
+            </w:r>
+          </w:p>
+        </w:tc>
+        <w:tc>
+          <w:tcPr>
+            <w:tcW w:type="dxa" w:w="5832"/>
+            <w:vAlign w:val="center"/>
+          </w:tcPr>
+          <w:p>
+            <w:r/>
+            <w:r>
+              <w:rPr>
+                <w:rFonts w:ascii="Arial" w:hAnsi="Arial"/>
+                <w:b w:val="0"/>
+                <w:color w:val="111827"/>
+                <w:sz w:val="17"/>
+              </w:rPr>
+              <w:t>Hệ thống không xác nhận vé nữa. Payment/booking chuyển EXPIRED để tránh giữ ghế quá lâu hoặc bán sai.</w:t>
+            </w:r>
+          </w:p>
+        </w:tc>
+      </w:tr>
+    </w:tbl>
+    <w:p/>
+    <w:p>
+      <w:pPr>
+        <w:pStyle w:val="Heading1"/>
+      </w:pPr>
+      <w:r>
+        <w:t>H. Checklist tự học nhanh</w:t>
+      </w:r>
+    </w:p>
+    <w:p>
+      <w:pPr>
+        <w:pStyle w:val="ListBullet"/>
+      </w:pPr>
+      <w:r>
+        <w:t>Bạn giải thích được khác nhau giữa VNPay redirect và SePay webhook.</w:t>
+      </w:r>
+    </w:p>
+    <w:p>
+      <w:pPr>
+        <w:pStyle w:val="ListBullet"/>
+      </w:pPr>
+      <w:r>
+        <w:t>Bạn biết payment SUCCESS chưa đủ; BookingService còn phải đổi booking, ghế và sinh ticket.</w:t>
+      </w:r>
+    </w:p>
+    <w:p>
+      <w:pPr>
+        <w:pStyle w:val="ListBullet"/>
+      </w:pPr>
+      <w:r>
+        <w:t>Bạn biết vì sao cần kiểm tra amount ở backend.</w:t>
+      </w:r>
+    </w:p>
+    <w:p>
+      <w:pPr>
+        <w:pStyle w:val="ListBullet"/>
+      </w:pPr>
+      <w:r>
+        <w:t>Bạn biết vì sao callback/webhook cần idempotent.</w:t>
+      </w:r>
+    </w:p>
+    <w:p>
+      <w:pPr>
+        <w:pStyle w:val="ListBullet"/>
+      </w:pPr>
+      <w:r>
+        <w:t>Bạn biết đọc log/payment event để debug giao dịch lỗi.</w:t>
+      </w:r>
+    </w:p>
+    <w:p>
+      <w:pPr>
+        <w:pStyle w:val="ListBullet"/>
+      </w:pPr>
+      <w:r>
+        <w:t>Bạn biết frontend không tự xác nhận vé, chỉ hiển thị trạng thái backend trả về.</w:t>
+      </w:r>
+    </w:p>
     <w:sectPr>
       <w:footerReference w:type="default" r:id="rId9"/>
       <w:pgSz w:w="12240" w:h="15840"/>
@@ -15495,6 +16675,18 @@
     <w:rPr>
       <w:rFonts w:ascii="Consolas" w:hAnsi="Consolas"/>
       <w:color w:val="1F2937"/>
+      <w:sz w:val="17"/>
+    </w:rPr>
+  </w:style>
+  <w:style w:type="paragraph" w:customStyle="1" w:styleId="LearningCode">
+    <w:name w:val="LearningCode"/>
+    <w:pPr>
+      <w:spacing w:before="80" w:after="160"/>
+      <w:ind w:left="259" w:right="259"/>
+    </w:pPr>
+    <w:rPr>
+      <w:rFonts w:ascii="Consolas" w:hAnsi="Consolas"/>
+      <w:color w:val="111827"/>
       <w:sz w:val="17"/>
     </w:rPr>
   </w:style>

</xml_diff>